<commit_message>
docs: integrantes del equipo en la hoja descriptiva
Co-Authored-By: Claude Opus 5.5 <noreply@anthropic.com>
Claude-Session: https://claude.ai/code/session_01SD86wWEgEE9tvD7EERFvnX
</commit_message>
<xml_diff>
--- a/docs/SafeWalk - Hoja descriptiva.docx
+++ b/docs/SafeWalk - Hoja descriptiva.docx
@@ -130,11 +130,7 @@
         <w:ind w:left="720"/>
       </w:pPr>
       <w:r>
-        <w:rPr>
-          <w:highlight w:val="yellow"/>
-          <w:highlightCs w:val="yellow"/>
-        </w:rPr>
-        <w:t xml:space="preserve">[Integrante 1]</w:t>
+        <w:t xml:space="preserve">Agustín Acosta</w:t>
       </w:r>
     </w:p>
     <w:p>
@@ -143,11 +139,7 @@
         <w:ind w:left="720"/>
       </w:pPr>
       <w:r>
-        <w:rPr>
-          <w:highlight w:val="yellow"/>
-          <w:highlightCs w:val="yellow"/>
-        </w:rPr>
-        <w:t xml:space="preserve">[Integrante 2]</w:t>
+        <w:t xml:space="preserve">Santino Bagatoli</w:t>
       </w:r>
     </w:p>
     <w:p>
@@ -156,11 +148,7 @@
         <w:ind w:left="720"/>
       </w:pPr>
       <w:r>
-        <w:rPr>
-          <w:highlight w:val="yellow"/>
-          <w:highlightCs w:val="yellow"/>
-        </w:rPr>
-        <w:t xml:space="preserve">[Integrante 3]</w:t>
+        <w:t xml:space="preserve">Máximo Naritelli</w:t>
       </w:r>
     </w:p>
     <w:p>
@@ -169,11 +157,7 @@
         <w:ind w:left="720"/>
       </w:pPr>
       <w:r>
-        <w:rPr>
-          <w:highlight w:val="yellow"/>
-          <w:highlightCs w:val="yellow"/>
-        </w:rPr>
-        <w:t xml:space="preserve">[Integrante 4]</w:t>
+        <w:t xml:space="preserve">Román Ferro</w:t>
       </w:r>
     </w:p>
     <w:p>

</xml_diff>